<commit_message>
Remove version/date line from PoA title page per Roy's question about version numbering
</commit_message>
<xml_diff>
--- a/thesis/final/Competency_Portfolio.docx
+++ b/thesis/final/Competency_Portfolio.docx
@@ -2388,231 +2388,183 @@
           <w:b/>
           <w:bCs/>
         </w:rPr>
-        <w:t xml:space="preserve">Feedback:</w:t>
-      </w:r>
-      <w:r>
-        <w:t xml:space="preserve"> </w:t>
-      </w:r>
-      <w:r>
-        <w:t xml:space="preserve">Galchin observed genuine interest and attention to detail in engaging with new</w:t>
-      </w:r>
-      <w:r>
-        <w:t xml:space="preserve"> </w:t>
-      </w:r>
-      <w:r>
-        <w:t xml:space="preserve">subject matter, noting that thorough understanding of the material enabled strong results. He</w:t>
-      </w:r>
-      <w:r>
-        <w:t xml:space="preserve"> </w:t>
-      </w:r>
-      <w:r>
-        <w:t xml:space="preserve">described the working process as smooth and professional, including the communication between them.</w:t>
-      </w:r>
-      <w:r>
-        <w:t xml:space="preserve"> </w:t>
-      </w:r>
-      <w:r>
-        <w:t xml:space="preserve">He noted that the internship demonstrated and developed skills acquired during academic training</w:t>
-      </w:r>
-      <w:r>
-        <w:t xml:space="preserve"> </w:t>
-      </w:r>
-      <w:r>
-        <w:t xml:space="preserve">and expressed that progress was visible and that Alexander is ready for broader and more complex</w:t>
-      </w:r>
-      <w:r>
-        <w:t xml:space="preserve"> </w:t>
-      </w:r>
-      <w:r>
-        <w:t xml:space="preserve">projects.</w:t>
-      </w:r>
-      <w:r>
-        <w:t xml:space="preserve"> </w:t>
-      </w:r>
+        <w:t xml:space="preserve">Feedback (original, Bulgarian):</w:t>
+      </w:r>
+    </w:p>
+    <w:p>
+      <w:pPr>
+        <w:pStyle w:val="BlockText"/>
+      </w:pPr>
+      <w:r>
+        <w:rPr>
+          <w:lang w:val="bg"/>
+        </w:rPr>
+        <w:t xml:space="preserve">Забелязвам проявеният интерес и вникването в детайли относно новата материя. Правилното разбиране ти е позволило да се справиш толкова добре със заданието. Работният процес минава гладко, професионално, също като комуникацията помежду ни. Чрез този стаж определено си развил и демонстрирал умения, придобити през учебния процес години назад. Прогресът е видим и тепърва ще го усъвършенстваш, респективно си готов за по-обширни и сложни проекти.</w:t>
+      </w:r>
+    </w:p>
+    <w:p>
+      <w:pPr>
+        <w:pStyle w:val="FirstParagraph"/>
+      </w:pPr>
       <w:r>
         <w:rPr>
           <w:b/>
           <w:bCs/>
         </w:rPr>
-        <w:t xml:space="preserve">Feedforward:</w:t>
-      </w:r>
-      <w:r>
-        <w:t xml:space="preserve"> </w:t>
-      </w:r>
-      <w:r>
-        <w:t xml:space="preserve">engage with new fields and niches that will be relevant long-term</w:t>
-      </w:r>
-      <w:r>
-        <w:t xml:space="preserve"> </w:t>
-      </w:r>
-      <w:r>
-        <w:t xml:space="preserve">as an investment in the future, broaden general knowledge as a key to progress, and always look for</w:t>
-      </w:r>
-      <w:r>
-        <w:t xml:space="preserve"> </w:t>
-      </w:r>
-      <w:r>
-        <w:t xml:space="preserve">added value in both personal and professional life.</w:t>
-      </w:r>
-    </w:p>
-    <w:p>
-      <w:pPr>
-        <w:pStyle w:val="BodyText"/>
+        <w:t xml:space="preserve">Feedback (English translation):</w:t>
+      </w:r>
+    </w:p>
+    <w:p>
+      <w:pPr>
+        <w:pStyle w:val="BlockText"/>
+      </w:pPr>
+      <w:r>
+        <w:t xml:space="preserve">“I notice the interest shown and the attention to detail regarding the new subject matter. Properly understanding it has allowed you to handle the assignment so well. The working process has gone smoothly, professionally, as has the communication between us. Through this internship you have clearly developed and demonstrated skills acquired during your studies years ago. Progress is visible and you will keep refining it further; accordingly, you are ready for broader and more complex projects.”</w:t>
+      </w:r>
+    </w:p>
+    <w:p>
+      <w:pPr>
+        <w:pStyle w:val="FirstParagraph"/>
       </w:pPr>
       <w:r>
         <w:rPr>
           <w:b/>
           <w:bCs/>
         </w:rPr>
-        <w:t xml:space="preserve">Response:</w:t>
-      </w:r>
-      <w:r>
-        <w:t xml:space="preserve"> </w:t>
-      </w:r>
-      <w:r>
-        <w:t xml:space="preserve">Galchin’s feedback affirms what was most valuable about the working structure of</w:t>
-      </w:r>
-      <w:r>
-        <w:t xml:space="preserve"> </w:t>
-      </w:r>
-      <w:r>
-        <w:t xml:space="preserve">this project: being trusted to set the direction and make technical decisions independently created</w:t>
-      </w:r>
-      <w:r>
-        <w:t xml:space="preserve"> </w:t>
-      </w:r>
-      <w:r>
-        <w:t xml:space="preserve">a level of ownership that would not have been possible in a more supervised environment. The</w:t>
-      </w:r>
-      <w:r>
-        <w:t xml:space="preserve"> </w:t>
-      </w:r>
-      <w:r>
-        <w:t xml:space="preserve">self-directed nature of the internship forced me to develop analytical accountability. Every design</w:t>
-      </w:r>
-      <w:r>
-        <w:t xml:space="preserve"> </w:t>
-      </w:r>
-      <w:r>
-        <w:t xml:space="preserve">choice was made by one person and had to be defensible on its own terms, without the safety net of</w:t>
-      </w:r>
-      <w:r>
-        <w:t xml:space="preserve"> </w:t>
-      </w:r>
-      <w:r>
-        <w:t xml:space="preserve">a technical peer review process. The feedforward on engaging with new fields resonates directly</w:t>
-      </w:r>
-      <w:r>
-        <w:t xml:space="preserve"> </w:t>
-      </w:r>
-      <w:r>
-        <w:t xml:space="preserve">with what this project demonstrated. The ability to develop functional competence in an unfamiliar</w:t>
-      </w:r>
-      <w:r>
-        <w:t xml:space="preserve"> </w:t>
-      </w:r>
-      <w:r>
-        <w:t xml:space="preserve">domain, such as health informatics and clinical score modelling, is a form of professional</w:t>
-      </w:r>
-      <w:r>
-        <w:t xml:space="preserve"> </w:t>
-      </w:r>
-      <w:r>
-        <w:t xml:space="preserve">capital that compounds over time. I intend to treat breadth of domain knowledge as a deliberate</w:t>
-      </w:r>
-      <w:r>
-        <w:t xml:space="preserve"> </w:t>
-      </w:r>
-      <w:r>
-        <w:t xml:space="preserve">investment rather than an incidental byproduct of whatever project arrives next.</w:t>
-      </w:r>
-    </w:p>
-    <w:p>
-      <w:pPr>
-        <w:pStyle w:val="BodyText"/>
+        <w:t xml:space="preserve">Feedforward (original, Bulgarian):</w:t>
+      </w:r>
+    </w:p>
+    <w:p>
+      <w:pPr>
+        <w:pStyle w:val="BlockText"/>
+      </w:pPr>
+      <w:r>
+        <w:rPr>
+          <w:lang w:val="bg"/>
+        </w:rPr>
+        <w:t xml:space="preserve">Да се захващаш с нови материи и ниши, които ще са актуални години напред – това е инвестиция в бъдещето ни. Да обогатяваш всячески общата си култура – ключът към прогреса! Винаги да търсиш добавената стойност в личния живот и работата си – да бъдеш в помощ на човечеството, да решаваш проблеми на близки и приятели.</w:t>
+      </w:r>
+    </w:p>
+    <w:p>
+      <w:pPr>
+        <w:pStyle w:val="FirstParagraph"/>
       </w:pPr>
       <w:r>
         <w:rPr>
           <w:b/>
           <w:bCs/>
         </w:rPr>
-        <w:t xml:space="preserve">Dani</w:t>
-      </w:r>
-      <w:r>
-        <w:t xml:space="preserve"> </w:t>
-      </w:r>
-      <w:r>
-        <w:t xml:space="preserve">is a classmate from Fontys University of Applied Sciences with whom I have worked</w:t>
-      </w:r>
-      <w:r>
-        <w:t xml:space="preserve"> </w:t>
-      </w:r>
-      <w:r>
-        <w:t xml:space="preserve">across multiple academic projects and courses over three years. He has observed my technical and</w:t>
-      </w:r>
-      <w:r>
-        <w:t xml:space="preserve"> </w:t>
-      </w:r>
-      <w:r>
-        <w:t xml:space="preserve">professional development directly in collaborative academic and project settings.</w:t>
-      </w:r>
-    </w:p>
-    <w:p>
-      <w:pPr>
-        <w:pStyle w:val="BodyText"/>
+        <w:t xml:space="preserve">Feedforward (English translation):</w:t>
+      </w:r>
+    </w:p>
+    <w:p>
+      <w:pPr>
+        <w:pStyle w:val="BlockText"/>
+      </w:pPr>
+      <w:r>
+        <w:t xml:space="preserve">“Take on new subjects and niches that will remain relevant years ahead – this is an investment in our future. Enrich your general knowledge in every way possible – the key to progress! Always look for added value in both your personal life and your work – be of help to humanity, solve problems for those close to you and for friends.”</w:t>
+      </w:r>
+    </w:p>
+    <w:p>
+      <w:pPr>
+        <w:pStyle w:val="FirstParagraph"/>
       </w:pPr>
       <w:r>
         <w:rPr>
           <w:b/>
           <w:bCs/>
         </w:rPr>
-        <w:t xml:space="preserve">Feedback:</w:t>
-      </w:r>
-      <w:r>
-        <w:t xml:space="preserve"> </w:t>
-      </w:r>
-      <w:r>
-        <w:t xml:space="preserve">Dani noted that Alexander is adept at taking on challenging tasks and meeting</w:t>
-      </w:r>
-      <w:r>
-        <w:t xml:space="preserve"> </w:t>
-      </w:r>
-      <w:r>
-        <w:t xml:space="preserve">deadlines, and that the quality of the work produced is high.</w:t>
-      </w:r>
-      <w:r>
-        <w:t xml:space="preserve"> </w:t>
-      </w:r>
+        <w:t xml:space="preserve">Response:</w:t>
+      </w:r>
+      <w:r>
+        <w:t xml:space="preserve"> </w:t>
+      </w:r>
+      <w:r>
+        <w:t xml:space="preserve">Galchin’s feedback affirms what was most valuable about the working structure of</w:t>
+      </w:r>
+      <w:r>
+        <w:t xml:space="preserve"> </w:t>
+      </w:r>
+      <w:r>
+        <w:t xml:space="preserve">this project: being trusted to set the direction and make technical decisions independently created</w:t>
+      </w:r>
+      <w:r>
+        <w:t xml:space="preserve"> </w:t>
+      </w:r>
+      <w:r>
+        <w:t xml:space="preserve">a level of ownership that would not have been possible in a more supervised environment. The</w:t>
+      </w:r>
+      <w:r>
+        <w:t xml:space="preserve"> </w:t>
+      </w:r>
+      <w:r>
+        <w:t xml:space="preserve">self-directed nature of the internship forced me to develop analytical accountability. Every design</w:t>
+      </w:r>
+      <w:r>
+        <w:t xml:space="preserve"> </w:t>
+      </w:r>
+      <w:r>
+        <w:t xml:space="preserve">choice was made by one person and had to be defensible on its own terms, without the safety net of</w:t>
+      </w:r>
+      <w:r>
+        <w:t xml:space="preserve"> </w:t>
+      </w:r>
+      <w:r>
+        <w:t xml:space="preserve">a technical peer review process. The feedforward on engaging with new fields resonates directly</w:t>
+      </w:r>
+      <w:r>
+        <w:t xml:space="preserve"> </w:t>
+      </w:r>
+      <w:r>
+        <w:t xml:space="preserve">with what this project demonstrated. The ability to develop functional competence in an unfamiliar</w:t>
+      </w:r>
+      <w:r>
+        <w:t xml:space="preserve"> </w:t>
+      </w:r>
+      <w:r>
+        <w:t xml:space="preserve">domain, such as health informatics and clinical score modelling, is a form of professional</w:t>
+      </w:r>
+      <w:r>
+        <w:t xml:space="preserve"> </w:t>
+      </w:r>
+      <w:r>
+        <w:t xml:space="preserve">capital that compounds over time. I intend to treat breadth of domain knowledge as a deliberate</w:t>
+      </w:r>
+      <w:r>
+        <w:t xml:space="preserve"> </w:t>
+      </w:r>
+      <w:r>
+        <w:t xml:space="preserve">investment rather than an incidental byproduct of whatever project arrives next.</w:t>
+      </w:r>
+    </w:p>
+    <w:p>
+      <w:pPr>
+        <w:pStyle w:val="BodyText"/>
+      </w:pPr>
       <w:r>
         <w:rPr>
           <w:b/>
           <w:bCs/>
         </w:rPr>
-        <w:t xml:space="preserve">Feedforward:</w:t>
-      </w:r>
-      <w:r>
-        <w:t xml:space="preserve"> </w:t>
-      </w:r>
-      <w:r>
-        <w:t xml:space="preserve">make the</w:t>
-      </w:r>
-      <w:r>
-        <w:t xml:space="preserve"> </w:t>
-      </w:r>
-      <w:r>
-        <w:t xml:space="preserve">quality and progress of the work more visible to supervisors and collaborators by communicating</w:t>
-      </w:r>
-      <w:r>
-        <w:t xml:space="preserve"> </w:t>
-      </w:r>
-      <w:r>
-        <w:t xml:space="preserve">updates more frequently, so that the effort behind the results is understood and not just the</w:t>
-      </w:r>
-      <w:r>
-        <w:t xml:space="preserve"> </w:t>
-      </w:r>
-      <w:r>
-        <w:t xml:space="preserve">results themselves.</w:t>
+        <w:t xml:space="preserve">Dani</w:t>
+      </w:r>
+      <w:r>
+        <w:t xml:space="preserve"> </w:t>
+      </w:r>
+      <w:r>
+        <w:t xml:space="preserve">is a classmate from Fontys University of Applied Sciences with whom I have worked</w:t>
+      </w:r>
+      <w:r>
+        <w:t xml:space="preserve"> </w:t>
+      </w:r>
+      <w:r>
+        <w:t xml:space="preserve">across multiple academic projects and courses over three years. He has observed my technical and</w:t>
+      </w:r>
+      <w:r>
+        <w:t xml:space="preserve"> </w:t>
+      </w:r>
+      <w:r>
+        <w:t xml:space="preserve">professional development directly in collaborative academic and project settings.</w:t>
       </w:r>
     </w:p>
     <w:p>
@@ -2624,148 +2576,164 @@
           <w:b/>
           <w:bCs/>
         </w:rPr>
-        <w:t xml:space="preserve">Response:</w:t>
-      </w:r>
-      <w:r>
-        <w:t xml:space="preserve"> </w:t>
-      </w:r>
-      <w:r>
-        <w:t xml:space="preserve">This feedforward identifies a pattern I recognise. My tendency is to work</w:t>
-      </w:r>
-      <w:r>
-        <w:t xml:space="preserve"> </w:t>
-      </w:r>
-      <w:r>
-        <w:t xml:space="preserve">independently until something is finished before surfacing it, which means the process behind a</w:t>
-      </w:r>
-      <w:r>
-        <w:t xml:space="preserve"> </w:t>
-      </w:r>
-      <w:r>
-        <w:t xml:space="preserve">result is often invisible to the people who need to see it. In the context of this internship, the</w:t>
-      </w:r>
-      <w:r>
-        <w:t xml:space="preserve"> </w:t>
-      </w:r>
-      <w:r>
-        <w:t xml:space="preserve">communication learning objective was specifically about addressing this: structuring regular updates</w:t>
-      </w:r>
-      <w:r>
-        <w:t xml:space="preserve"> </w:t>
-      </w:r>
-      <w:r>
-        <w:t xml:space="preserve">for Galchin, presenting interim findings to Peter P.A.L. van Alem, and building a tool that explains its own</w:t>
-      </w:r>
-      <w:r>
-        <w:t xml:space="preserve"> </w:t>
-      </w:r>
-      <w:r>
-        <w:t xml:space="preserve">outputs. The feedforward confirms that visibility of effort is a distinct skill from quality of</w:t>
-      </w:r>
-      <w:r>
-        <w:t xml:space="preserve"> </w:t>
-      </w:r>
-      <w:r>
-        <w:t xml:space="preserve">effort, and one I need to develop more deliberately going forward.</w:t>
-      </w:r>
-    </w:p>
-    <w:p>
-      <w:pPr>
-        <w:pStyle w:val="BodyText"/>
+        <w:t xml:space="preserve">Feedback (verbatim):</w:t>
+      </w:r>
+    </w:p>
+    <w:p>
+      <w:pPr>
+        <w:pStyle w:val="BlockText"/>
+      </w:pPr>
+      <w:r>
+        <w:t xml:space="preserve">“From experience with Alexander on several projects, he is quite adept at taking on hard tasks and meeting deadlines.”</w:t>
+      </w:r>
+    </w:p>
+    <w:p>
+      <w:pPr>
+        <w:pStyle w:val="FirstParagraph"/>
       </w:pPr>
       <w:r>
         <w:rPr>
           <w:b/>
           <w:bCs/>
         </w:rPr>
-        <w:t xml:space="preserve">Daniel</w:t>
-      </w:r>
-      <w:r>
-        <w:t xml:space="preserve"> </w:t>
-      </w:r>
-      <w:r>
-        <w:t xml:space="preserve">is a professional colleague from a collaborative project context at Accedia. He has</w:t>
-      </w:r>
-      <w:r>
-        <w:t xml:space="preserve"> </w:t>
-      </w:r>
-      <w:r>
-        <w:t xml:space="preserve">strong experience in machine learning engineering and software development, and the collaboration</w:t>
-      </w:r>
-      <w:r>
-        <w:t xml:space="preserve"> </w:t>
-      </w:r>
-      <w:r>
-        <w:t xml:space="preserve">involved building a recommendation system.</w:t>
-      </w:r>
-    </w:p>
-    <w:p>
-      <w:pPr>
-        <w:pStyle w:val="BodyText"/>
+        <w:t xml:space="preserve">Feedforward (verbatim):</w:t>
+      </w:r>
+    </w:p>
+    <w:p>
+      <w:pPr>
+        <w:pStyle w:val="BlockText"/>
+      </w:pPr>
+      <w:r>
+        <w:t xml:space="preserve">“He could however improve showing how impressive his work truly is. This could be done by updating his supervisors frequently on his work. If this is achieved, he will for sure gain that mass respect.”</w:t>
+      </w:r>
+    </w:p>
+    <w:p>
+      <w:pPr>
+        <w:pStyle w:val="FirstParagraph"/>
       </w:pPr>
       <w:r>
         <w:rPr>
           <w:b/>
           <w:bCs/>
         </w:rPr>
-        <w:t xml:space="preserve">Feedback:</w:t>
-      </w:r>
-      <w:r>
-        <w:t xml:space="preserve"> </w:t>
-      </w:r>
-      <w:r>
-        <w:t xml:space="preserve">Daniel observed strong ML and Python foundations from the start of the</w:t>
-      </w:r>
-      <w:r>
-        <w:t xml:space="preserve"> </w:t>
-      </w:r>
-      <w:r>
-        <w:t xml:space="preserve">collaboration, noting that Alexander applied theoretical and practical knowledge to tackle</w:t>
-      </w:r>
-      <w:r>
-        <w:t xml:space="preserve"> </w:t>
-      </w:r>
-      <w:r>
-        <w:t xml:space="preserve">challenging tasks while building a recommendation system. He highlighted the quality of work and</w:t>
-      </w:r>
-      <w:r>
-        <w:t xml:space="preserve"> </w:t>
-      </w:r>
-      <w:r>
-        <w:t xml:space="preserve">well-documented outcomes as particular strengths.</w:t>
-      </w:r>
-      <w:r>
-        <w:t xml:space="preserve"> </w:t>
-      </w:r>
+        <w:t xml:space="preserve">Response:</w:t>
+      </w:r>
+      <w:r>
+        <w:t xml:space="preserve"> </w:t>
+      </w:r>
+      <w:r>
+        <w:t xml:space="preserve">This feedforward identifies a pattern I recognise. My tendency is to work</w:t>
+      </w:r>
+      <w:r>
+        <w:t xml:space="preserve"> </w:t>
+      </w:r>
+      <w:r>
+        <w:t xml:space="preserve">independently until something is finished before surfacing it, which means the process behind a</w:t>
+      </w:r>
+      <w:r>
+        <w:t xml:space="preserve"> </w:t>
+      </w:r>
+      <w:r>
+        <w:t xml:space="preserve">result is often invisible to the people who need to see it. In the context of this internship, the</w:t>
+      </w:r>
+      <w:r>
+        <w:t xml:space="preserve"> </w:t>
+      </w:r>
+      <w:r>
+        <w:t xml:space="preserve">communication learning objective was specifically about addressing this: structuring regular updates</w:t>
+      </w:r>
+      <w:r>
+        <w:t xml:space="preserve"> </w:t>
+      </w:r>
+      <w:r>
+        <w:t xml:space="preserve">for Galchin, presenting interim findings to Peter P.A.L. van Alem, and building a tool that explains its own</w:t>
+      </w:r>
+      <w:r>
+        <w:t xml:space="preserve"> </w:t>
+      </w:r>
+      <w:r>
+        <w:t xml:space="preserve">outputs. The feedforward confirms that visibility of effort is a distinct skill from quality of</w:t>
+      </w:r>
+      <w:r>
+        <w:t xml:space="preserve"> </w:t>
+      </w:r>
+      <w:r>
+        <w:t xml:space="preserve">effort, and one I need to develop more deliberately going forward.</w:t>
+      </w:r>
+    </w:p>
+    <w:p>
+      <w:pPr>
+        <w:pStyle w:val="BodyText"/>
+      </w:pPr>
       <w:r>
         <w:rPr>
           <w:b/>
           <w:bCs/>
         </w:rPr>
-        <w:t xml:space="preserve">Feedforward:</w:t>
-      </w:r>
-      <w:r>
-        <w:t xml:space="preserve"> </w:t>
-      </w:r>
-      <w:r>
-        <w:t xml:space="preserve">develop the habit of</w:t>
-      </w:r>
-      <w:r>
-        <w:t xml:space="preserve"> </w:t>
-      </w:r>
-      <w:r>
-        <w:t xml:space="preserve">asking for assistance after spending meaningful time on a problem without reaching the desired</w:t>
-      </w:r>
-      <w:r>
-        <w:t xml:space="preserve"> </w:t>
-      </w:r>
-      <w:r>
-        <w:t xml:space="preserve">outcome, and invest in cloud provider knowledge as a long-term career priority.</w:t>
-      </w:r>
-    </w:p>
-    <w:p>
-      <w:pPr>
-        <w:pStyle w:val="BodyText"/>
+        <w:t xml:space="preserve">Daniel</w:t>
+      </w:r>
+      <w:r>
+        <w:t xml:space="preserve"> </w:t>
+      </w:r>
+      <w:r>
+        <w:t xml:space="preserve">is a professional colleague from a collaborative project context at Accedia. He has</w:t>
+      </w:r>
+      <w:r>
+        <w:t xml:space="preserve"> </w:t>
+      </w:r>
+      <w:r>
+        <w:t xml:space="preserve">strong experience in machine learning engineering and software development, and the collaboration</w:t>
+      </w:r>
+      <w:r>
+        <w:t xml:space="preserve"> </w:t>
+      </w:r>
+      <w:r>
+        <w:t xml:space="preserve">involved building a recommendation system.</w:t>
+      </w:r>
+    </w:p>
+    <w:p>
+      <w:pPr>
+        <w:pStyle w:val="BodyText"/>
+      </w:pPr>
+      <w:r>
+        <w:rPr>
+          <w:b/>
+          <w:bCs/>
+        </w:rPr>
+        <w:t xml:space="preserve">Feedback (verbatim):</w:t>
+      </w:r>
+    </w:p>
+    <w:p>
+      <w:pPr>
+        <w:pStyle w:val="BlockText"/>
+      </w:pPr>
+      <w:r>
+        <w:t xml:space="preserve">“Aleksandar has been part of the Data Science team for the past 3 months as of May 2026. Since the beginning he showed very strong foundation of machine learning and Python concepts. He has been using his theoretical and practical knowledge to tackle important and challenging tasks while building a recommendation system. Highlights of his effort are the quality of his work and the well-documented outcomes of the tasks.”</w:t>
+      </w:r>
+    </w:p>
+    <w:p>
+      <w:pPr>
+        <w:pStyle w:val="FirstParagraph"/>
+      </w:pPr>
+      <w:r>
+        <w:rPr>
+          <w:b/>
+          <w:bCs/>
+        </w:rPr>
+        <w:t xml:space="preserve">Feedforward (verbatim):</w:t>
+      </w:r>
+    </w:p>
+    <w:p>
+      <w:pPr>
+        <w:pStyle w:val="BlockText"/>
+      </w:pPr>
+      <w:r>
+        <w:t xml:space="preserve">“The skill that would improve himself as a data scientist and a developer as a whole in the long-term is to not be afraid to ask for assistance after spending time on a problem without reaching the desired outcome. Technical wise the software world has been going to the cloud for years now so learning about the products of the big cloud providers is always a good path.”</w:t>
+      </w:r>
+    </w:p>
+    <w:p>
+      <w:pPr>
+        <w:pStyle w:val="FirstParagraph"/>
       </w:pPr>
       <w:r>
         <w:rPr>
@@ -3214,7 +3182,7 @@
     </w:p>
     <w:bookmarkEnd w:id="22"/>
     <w:bookmarkEnd w:id="23"/>
-    <w:bookmarkStart w:id="28" w:name="part-3-overall-reflection"/>
+    <w:bookmarkStart w:id="29" w:name="part-3-overall-reflection"/>
     <w:p>
       <w:pPr>
         <w:pStyle w:val="Heading1"/>
@@ -3663,7 +3631,7 @@
       </w:r>
     </w:p>
     <w:bookmarkEnd w:id="25"/>
-    <w:bookmarkStart w:id="26" w:name="evidence-of-development"/>
+    <w:bookmarkStart w:id="27" w:name="evidence-of-development"/>
     <w:p>
       <w:pPr>
         <w:pStyle w:val="Heading2"/>
@@ -4088,6 +4056,26 @@
       <w:r>
         <w:t xml:space="preserve">developed over the course of the internship.</w:t>
       </w:r>
+      <w:r>
+        <w:t xml:space="preserve"> </w:t>
+      </w:r>
+      <w:r>
+        <w:t xml:space="preserve">The live application, including this page, is publicly accessible at</w:t>
+      </w:r>
+      <w:r>
+        <w:t xml:space="preserve"> </w:t>
+      </w:r>
+      <w:hyperlink r:id="rId26">
+        <w:r>
+          <w:rPr>
+            <w:rStyle w:val="Hyperlink"/>
+          </w:rPr>
+          <w:t xml:space="preserve">https://zdravoletie-app-r59gvphlkih7549cgipbgt.streamlit.app/About</w:t>
+        </w:r>
+      </w:hyperlink>
+      <w:r>
+        <w:t xml:space="preserve">.</w:t>
+      </w:r>
     </w:p>
     <w:p>
       <w:pPr>
@@ -4140,8 +4128,8 @@
         <w:t xml:space="preserve">early entries, shows development in analytical self-awareness over the internship period.</w:t>
       </w:r>
     </w:p>
-    <w:bookmarkEnd w:id="26"/>
-    <w:bookmarkStart w:id="27" w:name="areas-for-further-development"/>
+    <w:bookmarkEnd w:id="27"/>
+    <w:bookmarkStart w:id="28" w:name="areas-for-further-development"/>
     <w:p>
       <w:pPr>
         <w:pStyle w:val="Heading2"/>
@@ -4370,9 +4358,9 @@
         <w:t xml:space="preserve">development, and one I will treat as a deliberate practice rather than an occasional choice.</w:t>
       </w:r>
     </w:p>
-    <w:bookmarkEnd w:id="27"/>
     <w:bookmarkEnd w:id="28"/>
-    <w:bookmarkStart w:id="33" w:name="ethical-considerations"/>
+    <w:bookmarkEnd w:id="29"/>
+    <w:bookmarkStart w:id="34" w:name="ethical-considerations"/>
     <w:p>
       <w:pPr>
         <w:pStyle w:val="Heading1"/>
@@ -4381,7 +4369,7 @@
         <w:t xml:space="preserve">Ethical Considerations</w:t>
       </w:r>
     </w:p>
-    <w:bookmarkStart w:id="29" w:name="data-classification-under-gdpr"/>
+    <w:bookmarkStart w:id="30" w:name="data-classification-under-gdpr"/>
     <w:p>
       <w:pPr>
         <w:pStyle w:val="Heading2"/>
@@ -4406,8 +4394,8 @@
         <w:t xml:space="preserve">Of the 158 records in the dataset, 103 carry the name value Unknown. The remaining 50 records carry values that appear to be dates of birth encoded as six-digit strings, which are pseudonyms rather than true names but remain linkable to individuals within the clinic’s operational records. The original_url and id fields contain Anovator platform identifiers that could be used to retrieve additional personal data; these fields were not used in any modelling or analysis and are excluded from the model feature set.</w:t>
       </w:r>
     </w:p>
-    <w:bookmarkEnd w:id="29"/>
-    <w:bookmarkStart w:id="30" w:name="consent-assumptions"/>
+    <w:bookmarkEnd w:id="30"/>
+    <w:bookmarkStart w:id="31" w:name="consent-assumptions"/>
     <w:p>
       <w:pPr>
         <w:pStyle w:val="Heading2"/>
@@ -4424,8 +4412,8 @@
         <w:t xml:space="preserve">The data were collected in the course of normal clinical operations at Zdravoletie. It is assumed that Zdravoletie’s standard client intake process includes consent to collection and processing of biometric data for health assessment purposes. However, this study did not verify whether clients were specifically informed that their scan data would be used for machine learning research or shared with a student researcher. This represents a gap relative to the Article 9(2)(a) explicit consent standard for research use of special category data.</w:t>
       </w:r>
     </w:p>
-    <w:bookmarkEnd w:id="30"/>
-    <w:bookmarkStart w:id="31" w:name="data-handling-in-this-study"/>
+    <w:bookmarkEnd w:id="31"/>
+    <w:bookmarkStart w:id="32" w:name="data-handling-in-this-study"/>
     <w:p>
       <w:pPr>
         <w:pStyle w:val="Heading2"/>
@@ -4442,8 +4430,8 @@
         <w:t xml:space="preserve">The dataset was transferred to the researcher’s local development environment as a CSV export and was not uploaded to any public repository, cloud storage service, or third-party platform during analysis. All modelling, experiment scripts, and visualisations were executed locally. The Streamlit dashboard does not transmit client data to external servers; all prediction and SHAP computation runs client-side within the Streamlit session. Model artifact files (.joblib) stored in the repository contain only fitted model parameters and no training records.</w:t>
       </w:r>
     </w:p>
-    <w:bookmarkEnd w:id="31"/>
-    <w:bookmarkStart w:id="32" w:name="requirements-for-production-deployment"/>
+    <w:bookmarkEnd w:id="32"/>
+    <w:bookmarkStart w:id="33" w:name="requirements-for-production-deployment"/>
     <w:p>
       <w:pPr>
         <w:pStyle w:val="Heading2"/>
@@ -4460,8 +4448,8 @@
         <w:t xml:space="preserve">A production deployment of the Streamlit dashboard or any successor system would require several steps before going live. A Data Protection Impact Assessment (DPIA) under Article 35 GDPR must be completed. Explicit informed consent forms covering research and analytical use of scan data must be in place, alongside a Data Processing Agreement under Article 28 GDPR with any cloud hosting provider. Access must be restricted to authorised clinic staff through authentication, with audit logging of record access. A documented data retention policy is also required for compliance with Article 17 erasure requests.</w:t>
       </w:r>
     </w:p>
-    <w:bookmarkEnd w:id="32"/>
     <w:bookmarkEnd w:id="33"/>
+    <w:bookmarkEnd w:id="34"/>
     <w:sectPr>
       <w:footnotePr>
         <w:numRestart w:val="eachSect"/>

</xml_diff>